<commit_message>
Phase 1: Complete TypeScript setup, plan.md, and Academy domain model
</commit_message>
<xml_diff>
--- a/BrightPath_CRM_Full_Master_Build_Prompt.docx
+++ b/BrightPath_CRM_Full_Master_Build_Prompt.docx
@@ -13532,6 +13532,1441 @@
         <w:jc w:val="left"/>
         <w:rPr/>
       </w:pPr>
+      <w:r>
+        <w:rPr>
+          <w:rtl w:val="0"/>
+        </w:rPr>
+      </w:r>
+    </w:p>
+    <w:p>
+      <w:pPr>
+        <w:keepNext w:val="0"/>
+        <w:keepLines w:val="0"/>
+        <w:pageBreakBefore w:val="0"/>
+        <w:widowControl w:val="1"/>
+        <w:pBdr>
+          <w:top w:space="0" w:sz="0" w:val="nil"/>
+          <w:left w:space="0" w:sz="0" w:val="nil"/>
+          <w:bottom w:space="0" w:sz="0" w:val="nil"/>
+          <w:right w:space="0" w:sz="0" w:val="nil"/>
+          <w:between w:space="0" w:sz="0" w:val="nil"/>
+        </w:pBdr>
+        <w:shd w:fill="auto" w:val="clear"/>
+        <w:spacing w:after="20" w:before="0" w:line="276" w:lineRule="auto"/>
+        <w:ind w:right="0"/>
+        <w:jc w:val="left"/>
+        <w:rPr/>
+      </w:pPr>
+      <w:r>
+        <w:rPr>
+          <w:rtl w:val="0"/>
+        </w:rPr>
+      </w:r>
+    </w:p>
+    <w:p>
+      <w:pPr>
+        <w:keepNext w:val="0"/>
+        <w:keepLines w:val="0"/>
+        <w:pageBreakBefore w:val="0"/>
+        <w:widowControl w:val="1"/>
+        <w:pBdr>
+          <w:top w:space="0" w:sz="0" w:val="nil"/>
+          <w:left w:space="0" w:sz="0" w:val="nil"/>
+          <w:bottom w:space="0" w:sz="0" w:val="nil"/>
+          <w:right w:space="0" w:sz="0" w:val="nil"/>
+          <w:between w:space="0" w:sz="0" w:val="nil"/>
+        </w:pBdr>
+        <w:shd w:fill="auto" w:val="clear"/>
+        <w:spacing w:after="20" w:before="0" w:line="276" w:lineRule="auto"/>
+        <w:ind w:right="0"/>
+        <w:jc w:val="left"/>
+        <w:rPr/>
+      </w:pPr>
+      <w:r>
+        <w:rPr>
+          <w:rtl w:val="0"/>
+        </w:rPr>
+      </w:r>
+    </w:p>
+    <w:p>
+      <w:pPr>
+        <w:keepNext w:val="0"/>
+        <w:keepLines w:val="0"/>
+        <w:pageBreakBefore w:val="0"/>
+        <w:widowControl w:val="1"/>
+        <w:pBdr>
+          <w:top w:space="0" w:sz="0" w:val="nil"/>
+          <w:left w:space="0" w:sz="0" w:val="nil"/>
+          <w:bottom w:space="0" w:sz="0" w:val="nil"/>
+          <w:right w:space="0" w:sz="0" w:val="nil"/>
+          <w:between w:space="0" w:sz="0" w:val="nil"/>
+        </w:pBdr>
+        <w:shd w:fill="auto" w:val="clear"/>
+        <w:spacing w:after="20" w:before="0" w:line="276" w:lineRule="auto"/>
+        <w:ind w:right="0"/>
+        <w:jc w:val="left"/>
+        <w:rPr/>
+      </w:pPr>
+      <w:r>
+        <w:rPr>
+          <w:rtl w:val="0"/>
+        </w:rPr>
+      </w:r>
+    </w:p>
+    <w:p>
+      <w:pPr>
+        <w:keepNext w:val="0"/>
+        <w:keepLines w:val="0"/>
+        <w:pageBreakBefore w:val="0"/>
+        <w:widowControl w:val="1"/>
+        <w:pBdr>
+          <w:top w:space="0" w:sz="0" w:val="nil"/>
+          <w:left w:space="0" w:sz="0" w:val="nil"/>
+          <w:bottom w:space="0" w:sz="0" w:val="nil"/>
+          <w:right w:space="0" w:sz="0" w:val="nil"/>
+          <w:between w:space="0" w:sz="0" w:val="nil"/>
+        </w:pBdr>
+        <w:shd w:fill="auto" w:val="clear"/>
+        <w:spacing w:after="20" w:before="0" w:line="276" w:lineRule="auto"/>
+        <w:ind w:right="0"/>
+        <w:jc w:val="left"/>
+        <w:rPr/>
+      </w:pPr>
+      <w:r>
+        <w:rPr>
+          <w:rtl w:val="0"/>
+        </w:rPr>
+      </w:r>
+    </w:p>
+    <w:p>
+      <w:pPr>
+        <w:keepNext w:val="0"/>
+        <w:keepLines w:val="0"/>
+        <w:pageBreakBefore w:val="0"/>
+        <w:widowControl w:val="1"/>
+        <w:pBdr>
+          <w:top w:space="0" w:sz="0" w:val="nil"/>
+          <w:left w:space="0" w:sz="0" w:val="nil"/>
+          <w:bottom w:space="0" w:sz="0" w:val="nil"/>
+          <w:right w:space="0" w:sz="0" w:val="nil"/>
+          <w:between w:space="0" w:sz="0" w:val="nil"/>
+        </w:pBdr>
+        <w:shd w:fill="auto" w:val="clear"/>
+        <w:spacing w:after="20" w:before="0" w:line="276" w:lineRule="auto"/>
+        <w:ind w:right="0"/>
+        <w:jc w:val="left"/>
+        <w:rPr/>
+      </w:pPr>
+      <w:r>
+        <w:rPr>
+          <w:rtl w:val="0"/>
+        </w:rPr>
+      </w:r>
+    </w:p>
+    <w:p>
+      <w:pPr>
+        <w:keepNext w:val="0"/>
+        <w:keepLines w:val="0"/>
+        <w:pageBreakBefore w:val="0"/>
+        <w:widowControl w:val="1"/>
+        <w:pBdr>
+          <w:top w:space="0" w:sz="0" w:val="nil"/>
+          <w:left w:space="0" w:sz="0" w:val="nil"/>
+          <w:bottom w:space="0" w:sz="0" w:val="nil"/>
+          <w:right w:space="0" w:sz="0" w:val="nil"/>
+          <w:between w:space="0" w:sz="0" w:val="nil"/>
+        </w:pBdr>
+        <w:shd w:fill="auto" w:val="clear"/>
+        <w:spacing w:after="20" w:before="0" w:line="276" w:lineRule="auto"/>
+        <w:ind w:right="0"/>
+        <w:jc w:val="left"/>
+        <w:rPr/>
+      </w:pPr>
+      <w:r>
+        <w:rPr>
+          <w:rtl w:val="0"/>
+        </w:rPr>
+      </w:r>
+    </w:p>
+    <w:p>
+      <w:pPr>
+        <w:keepNext w:val="0"/>
+        <w:keepLines w:val="0"/>
+        <w:pageBreakBefore w:val="0"/>
+        <w:widowControl w:val="1"/>
+        <w:pBdr>
+          <w:top w:space="0" w:sz="0" w:val="nil"/>
+          <w:left w:space="0" w:sz="0" w:val="nil"/>
+          <w:bottom w:space="0" w:sz="0" w:val="nil"/>
+          <w:right w:space="0" w:sz="0" w:val="nil"/>
+          <w:between w:space="0" w:sz="0" w:val="nil"/>
+        </w:pBdr>
+        <w:shd w:fill="auto" w:val="clear"/>
+        <w:spacing w:after="20" w:before="0" w:line="276" w:lineRule="auto"/>
+        <w:ind w:right="0"/>
+        <w:jc w:val="left"/>
+        <w:rPr/>
+      </w:pPr>
+      <w:r>
+        <w:rPr>
+          <w:rtl w:val="0"/>
+        </w:rPr>
+      </w:r>
+    </w:p>
+    <w:p>
+      <w:pPr>
+        <w:keepNext w:val="0"/>
+        <w:keepLines w:val="0"/>
+        <w:pageBreakBefore w:val="0"/>
+        <w:widowControl w:val="1"/>
+        <w:pBdr>
+          <w:top w:space="0" w:sz="0" w:val="nil"/>
+          <w:left w:space="0" w:sz="0" w:val="nil"/>
+          <w:bottom w:space="0" w:sz="0" w:val="nil"/>
+          <w:right w:space="0" w:sz="0" w:val="nil"/>
+          <w:between w:space="0" w:sz="0" w:val="nil"/>
+        </w:pBdr>
+        <w:shd w:fill="auto" w:val="clear"/>
+        <w:spacing w:after="20" w:before="0" w:line="276" w:lineRule="auto"/>
+        <w:ind w:right="0"/>
+        <w:jc w:val="left"/>
+        <w:rPr/>
+      </w:pPr>
+      <w:r>
+        <w:rPr>
+          <w:rtl w:val="0"/>
+        </w:rPr>
+      </w:r>
+    </w:p>
+    <w:p>
+      <w:pPr>
+        <w:keepNext w:val="0"/>
+        <w:keepLines w:val="0"/>
+        <w:pageBreakBefore w:val="0"/>
+        <w:widowControl w:val="1"/>
+        <w:pBdr>
+          <w:top w:space="0" w:sz="0" w:val="nil"/>
+          <w:left w:space="0" w:sz="0" w:val="nil"/>
+          <w:bottom w:space="0" w:sz="0" w:val="nil"/>
+          <w:right w:space="0" w:sz="0" w:val="nil"/>
+          <w:between w:space="0" w:sz="0" w:val="nil"/>
+        </w:pBdr>
+        <w:shd w:fill="auto" w:val="clear"/>
+        <w:spacing w:after="20" w:before="0" w:line="276" w:lineRule="auto"/>
+        <w:ind w:right="0"/>
+        <w:jc w:val="left"/>
+        <w:rPr/>
+      </w:pPr>
+      <w:r>
+        <w:rPr>
+          <w:rtl w:val="0"/>
+        </w:rPr>
+      </w:r>
+    </w:p>
+    <w:p>
+      <w:pPr>
+        <w:keepNext w:val="0"/>
+        <w:keepLines w:val="0"/>
+        <w:pageBreakBefore w:val="0"/>
+        <w:widowControl w:val="1"/>
+        <w:pBdr>
+          <w:top w:space="0" w:sz="0" w:val="nil"/>
+          <w:left w:space="0" w:sz="0" w:val="nil"/>
+          <w:bottom w:space="0" w:sz="0" w:val="nil"/>
+          <w:right w:space="0" w:sz="0" w:val="nil"/>
+          <w:between w:space="0" w:sz="0" w:val="nil"/>
+        </w:pBdr>
+        <w:shd w:fill="auto" w:val="clear"/>
+        <w:spacing w:after="20" w:before="0" w:line="276" w:lineRule="auto"/>
+        <w:ind w:right="0"/>
+        <w:jc w:val="left"/>
+        <w:rPr/>
+      </w:pPr>
+      <w:r>
+        <w:rPr>
+          <w:rtl w:val="0"/>
+        </w:rPr>
+      </w:r>
+    </w:p>
+    <w:p>
+      <w:pPr>
+        <w:keepNext w:val="0"/>
+        <w:keepLines w:val="0"/>
+        <w:pageBreakBefore w:val="0"/>
+        <w:widowControl w:val="1"/>
+        <w:pBdr>
+          <w:top w:space="0" w:sz="0" w:val="nil"/>
+          <w:left w:space="0" w:sz="0" w:val="nil"/>
+          <w:bottom w:space="0" w:sz="0" w:val="nil"/>
+          <w:right w:space="0" w:sz="0" w:val="nil"/>
+          <w:between w:space="0" w:sz="0" w:val="nil"/>
+        </w:pBdr>
+        <w:shd w:fill="auto" w:val="clear"/>
+        <w:spacing w:after="20" w:before="0" w:line="276" w:lineRule="auto"/>
+        <w:ind w:right="0"/>
+        <w:jc w:val="left"/>
+        <w:rPr/>
+      </w:pPr>
+      <w:r>
+        <w:rPr>
+          <w:rtl w:val="0"/>
+        </w:rPr>
+      </w:r>
+    </w:p>
+    <w:p>
+      <w:pPr>
+        <w:keepNext w:val="0"/>
+        <w:keepLines w:val="0"/>
+        <w:pageBreakBefore w:val="0"/>
+        <w:widowControl w:val="1"/>
+        <w:pBdr>
+          <w:top w:space="0" w:sz="0" w:val="nil"/>
+          <w:left w:space="0" w:sz="0" w:val="nil"/>
+          <w:bottom w:space="0" w:sz="0" w:val="nil"/>
+          <w:right w:space="0" w:sz="0" w:val="nil"/>
+          <w:between w:space="0" w:sz="0" w:val="nil"/>
+        </w:pBdr>
+        <w:shd w:fill="auto" w:val="clear"/>
+        <w:spacing w:after="20" w:before="0" w:line="276" w:lineRule="auto"/>
+        <w:ind w:right="0"/>
+        <w:jc w:val="left"/>
+        <w:rPr/>
+      </w:pPr>
+      <w:r>
+        <w:rPr>
+          <w:rtl w:val="0"/>
+        </w:rPr>
+      </w:r>
+    </w:p>
+    <w:p>
+      <w:pPr>
+        <w:keepNext w:val="0"/>
+        <w:keepLines w:val="0"/>
+        <w:pageBreakBefore w:val="0"/>
+        <w:widowControl w:val="1"/>
+        <w:pBdr>
+          <w:top w:space="0" w:sz="0" w:val="nil"/>
+          <w:left w:space="0" w:sz="0" w:val="nil"/>
+          <w:bottom w:space="0" w:sz="0" w:val="nil"/>
+          <w:right w:space="0" w:sz="0" w:val="nil"/>
+          <w:between w:space="0" w:sz="0" w:val="nil"/>
+        </w:pBdr>
+        <w:shd w:fill="auto" w:val="clear"/>
+        <w:spacing w:after="20" w:before="0" w:line="276" w:lineRule="auto"/>
+        <w:ind w:right="0"/>
+        <w:jc w:val="left"/>
+        <w:rPr/>
+      </w:pPr>
+      <w:r>
+        <w:rPr>
+          <w:rtl w:val="0"/>
+        </w:rPr>
+      </w:r>
+    </w:p>
+    <w:p>
+      <w:pPr>
+        <w:keepNext w:val="0"/>
+        <w:keepLines w:val="0"/>
+        <w:pageBreakBefore w:val="0"/>
+        <w:widowControl w:val="1"/>
+        <w:pBdr>
+          <w:top w:space="0" w:sz="0" w:val="nil"/>
+          <w:left w:space="0" w:sz="0" w:val="nil"/>
+          <w:bottom w:space="0" w:sz="0" w:val="nil"/>
+          <w:right w:space="0" w:sz="0" w:val="nil"/>
+          <w:between w:space="0" w:sz="0" w:val="nil"/>
+        </w:pBdr>
+        <w:shd w:fill="auto" w:val="clear"/>
+        <w:spacing w:after="20" w:before="0" w:line="276" w:lineRule="auto"/>
+        <w:ind w:right="0"/>
+        <w:jc w:val="left"/>
+        <w:rPr/>
+      </w:pPr>
+      <w:r>
+        <w:rPr>
+          <w:rtl w:val="0"/>
+        </w:rPr>
+      </w:r>
+    </w:p>
+    <w:p>
+      <w:pPr>
+        <w:keepNext w:val="0"/>
+        <w:keepLines w:val="0"/>
+        <w:pageBreakBefore w:val="0"/>
+        <w:widowControl w:val="1"/>
+        <w:pBdr>
+          <w:top w:space="0" w:sz="0" w:val="nil"/>
+          <w:left w:space="0" w:sz="0" w:val="nil"/>
+          <w:bottom w:space="0" w:sz="0" w:val="nil"/>
+          <w:right w:space="0" w:sz="0" w:val="nil"/>
+          <w:between w:space="0" w:sz="0" w:val="nil"/>
+        </w:pBdr>
+        <w:shd w:fill="auto" w:val="clear"/>
+        <w:spacing w:after="20" w:before="0" w:line="276" w:lineRule="auto"/>
+        <w:ind w:right="0"/>
+        <w:jc w:val="left"/>
+        <w:rPr/>
+      </w:pPr>
+      <w:r>
+        <w:rPr>
+          <w:rtl w:val="0"/>
+        </w:rPr>
+      </w:r>
+    </w:p>
+    <w:p>
+      <w:pPr>
+        <w:keepNext w:val="0"/>
+        <w:keepLines w:val="0"/>
+        <w:pageBreakBefore w:val="0"/>
+        <w:widowControl w:val="1"/>
+        <w:pBdr>
+          <w:top w:space="0" w:sz="0" w:val="nil"/>
+          <w:left w:space="0" w:sz="0" w:val="nil"/>
+          <w:bottom w:space="0" w:sz="0" w:val="nil"/>
+          <w:right w:space="0" w:sz="0" w:val="nil"/>
+          <w:between w:space="0" w:sz="0" w:val="nil"/>
+        </w:pBdr>
+        <w:shd w:fill="auto" w:val="clear"/>
+        <w:spacing w:after="20" w:before="0" w:line="276" w:lineRule="auto"/>
+        <w:ind w:right="0"/>
+        <w:jc w:val="left"/>
+        <w:rPr/>
+      </w:pPr>
+      <w:r>
+        <w:rPr>
+          <w:rtl w:val="0"/>
+        </w:rPr>
+      </w:r>
+    </w:p>
+    <w:p>
+      <w:pPr>
+        <w:keepNext w:val="0"/>
+        <w:keepLines w:val="0"/>
+        <w:pageBreakBefore w:val="0"/>
+        <w:widowControl w:val="1"/>
+        <w:pBdr>
+          <w:top w:space="0" w:sz="0" w:val="nil"/>
+          <w:left w:space="0" w:sz="0" w:val="nil"/>
+          <w:bottom w:space="0" w:sz="0" w:val="nil"/>
+          <w:right w:space="0" w:sz="0" w:val="nil"/>
+          <w:between w:space="0" w:sz="0" w:val="nil"/>
+        </w:pBdr>
+        <w:shd w:fill="auto" w:val="clear"/>
+        <w:spacing w:after="20" w:before="0" w:line="276" w:lineRule="auto"/>
+        <w:ind w:right="0"/>
+        <w:jc w:val="left"/>
+        <w:rPr/>
+      </w:pPr>
+      <w:r>
+        <w:rPr>
+          <w:rtl w:val="0"/>
+        </w:rPr>
+      </w:r>
+    </w:p>
+    <w:p>
+      <w:pPr>
+        <w:keepNext w:val="0"/>
+        <w:keepLines w:val="0"/>
+        <w:pageBreakBefore w:val="0"/>
+        <w:widowControl w:val="1"/>
+        <w:pBdr>
+          <w:top w:space="0" w:sz="0" w:val="nil"/>
+          <w:left w:space="0" w:sz="0" w:val="nil"/>
+          <w:bottom w:space="0" w:sz="0" w:val="nil"/>
+          <w:right w:space="0" w:sz="0" w:val="nil"/>
+          <w:between w:space="0" w:sz="0" w:val="nil"/>
+        </w:pBdr>
+        <w:shd w:fill="auto" w:val="clear"/>
+        <w:spacing w:after="20" w:before="0" w:line="276" w:lineRule="auto"/>
+        <w:ind w:right="0"/>
+        <w:jc w:val="left"/>
+        <w:rPr/>
+      </w:pPr>
+      <w:r>
+        <w:rPr>
+          <w:rtl w:val="0"/>
+        </w:rPr>
+      </w:r>
+    </w:p>
+    <w:p>
+      <w:pPr>
+        <w:spacing w:after="20" w:lineRule="auto"/>
+        <w:rPr>
+          <w:rFonts w:ascii="Arial" w:cs="Arial" w:eastAsia="Arial" w:hAnsi="Arial"/>
+          <w:b w:val="1"/>
+          <w:bCs w:val="1"/>
+          <w:sz w:val="27"/>
+          <w:szCs w:val="27"/>
+        </w:rPr>
+      </w:pPr>
+      <w:r>
+        <w:rPr>
+          <w:rFonts w:ascii="Arial" w:cs="Arial" w:eastAsia="Arial" w:hAnsi="Arial"/>
+          <w:b w:val="1"/>
+          <w:bCs w:val="1"/>
+          <w:sz w:val="27"/>
+          <w:szCs w:val="27"/>
+          <w:rtl w:val="0"/>
+        </w:rPr>
+        <w:t xml:space="preserve">Prompt 1</w:t>
+      </w:r>
+    </w:p>
+    <w:p>
+      <w:pPr>
+        <w:spacing w:after="20" w:lineRule="auto"/>
+        <w:rPr/>
+      </w:pPr>
+      <w:r>
+        <w:rPr>
+          <w:rtl w:val="0"/>
+        </w:rPr>
+      </w:r>
+    </w:p>
+    <w:p>
+      <w:pPr>
+        <w:spacing w:after="20" w:lineRule="auto"/>
+        <w:rPr/>
+      </w:pPr>
+      <w:r>
+        <w:rPr>
+          <w:rtl w:val="0"/>
+        </w:rPr>
+      </w:r>
+    </w:p>
+    <w:p>
+      <w:pPr>
+        <w:spacing w:after="20" w:lineRule="auto"/>
+        <w:rPr>
+          <w:rFonts w:ascii="Arial" w:cs="Arial" w:eastAsia="Arial" w:hAnsi="Arial"/>
+          <w:sz w:val="23"/>
+          <w:szCs w:val="23"/>
+        </w:rPr>
+      </w:pPr>
+      <w:r>
+        <w:rPr>
+          <w:rFonts w:ascii="Arial" w:cs="Arial" w:eastAsia="Arial" w:hAnsi="Arial"/>
+          <w:sz w:val="23"/>
+          <w:szCs w:val="23"/>
+          <w:rtl w:val="0"/>
+        </w:rPr>
+        <w:t xml:space="preserve">Read the BrightPath CRM master specification completely. Inspect my current project and explain what is already present.</w:t>
+      </w:r>
+    </w:p>
+    <w:p>
+      <w:pPr>
+        <w:spacing w:after="20" w:lineRule="auto"/>
+        <w:rPr/>
+      </w:pPr>
+      <w:r>
+        <w:rPr>
+          <w:rtl w:val="0"/>
+        </w:rPr>
+      </w:r>
+    </w:p>
+    <w:p>
+      <w:pPr>
+        <w:spacing w:after="20" w:lineRule="auto"/>
+        <w:rPr/>
+      </w:pPr>
+      <w:r>
+        <w:rPr>
+          <w:rtl w:val="0"/>
+        </w:rPr>
+      </w:r>
+    </w:p>
+    <w:p>
+      <w:pPr>
+        <w:spacing w:after="20" w:lineRule="auto"/>
+        <w:rPr>
+          <w:rFonts w:ascii="Arial" w:cs="Arial" w:eastAsia="Arial" w:hAnsi="Arial"/>
+          <w:sz w:val="23"/>
+          <w:szCs w:val="23"/>
+        </w:rPr>
+      </w:pPr>
+      <w:r>
+        <w:rPr>
+          <w:rFonts w:ascii="Arial" w:cs="Arial" w:eastAsia="Arial" w:hAnsi="Arial"/>
+          <w:sz w:val="23"/>
+          <w:szCs w:val="23"/>
+          <w:rtl w:val="0"/>
+        </w:rPr>
+        <w:t xml:space="preserve">Do not edit any files yet. Summarise the application requirements, proposed architecture, main components, database tables, security requirements and implementation plan.</w:t>
+      </w:r>
+    </w:p>
+    <w:p>
+      <w:pPr>
+        <w:spacing w:after="20" w:lineRule="auto"/>
+        <w:rPr/>
+      </w:pPr>
+      <w:r>
+        <w:rPr>
+          <w:rtl w:val="0"/>
+        </w:rPr>
+      </w:r>
+    </w:p>
+    <w:p>
+      <w:pPr>
+        <w:spacing w:after="20" w:lineRule="auto"/>
+        <w:rPr/>
+      </w:pPr>
+      <w:r>
+        <w:rPr>
+          <w:rtl w:val="0"/>
+        </w:rPr>
+      </w:r>
+    </w:p>
+    <w:p>
+      <w:pPr>
+        <w:spacing w:after="20" w:lineRule="auto"/>
+        <w:rPr>
+          <w:rFonts w:ascii="Arial" w:cs="Arial" w:eastAsia="Arial" w:hAnsi="Arial"/>
+          <w:sz w:val="23"/>
+          <w:szCs w:val="23"/>
+        </w:rPr>
+      </w:pPr>
+      <w:r>
+        <w:rPr>
+          <w:rFonts w:ascii="Arial" w:cs="Arial" w:eastAsia="Arial" w:hAnsi="Arial"/>
+          <w:sz w:val="23"/>
+          <w:szCs w:val="23"/>
+          <w:rtl w:val="0"/>
+        </w:rPr>
+        <w:t xml:space="preserve">Identify missing dependencies, environment variables and account setup steps. Break the work into small phases with clear acceptance criteria. Explain the commands you intend to run and any risks before implementation. Wait for my approval before modifying the project.</w:t>
+      </w:r>
+    </w:p>
+    <w:p>
+      <w:pPr>
+        <w:spacing w:after="20" w:lineRule="auto"/>
+        <w:rPr/>
+      </w:pPr>
+      <w:r>
+        <w:rPr>
+          <w:rtl w:val="0"/>
+        </w:rPr>
+      </w:r>
+    </w:p>
+    <w:p>
+      <w:pPr>
+        <w:spacing w:after="20" w:lineRule="auto"/>
+        <w:rPr/>
+      </w:pPr>
+      <w:r>
+        <w:rPr>
+          <w:rtl w:val="0"/>
+        </w:rPr>
+      </w:r>
+    </w:p>
+    <w:p>
+      <w:pPr>
+        <w:spacing w:after="20" w:lineRule="auto"/>
+        <w:rPr>
+          <w:rFonts w:ascii="Arial" w:cs="Arial" w:eastAsia="Arial" w:hAnsi="Arial"/>
+          <w:sz w:val="23"/>
+          <w:szCs w:val="23"/>
+        </w:rPr>
+      </w:pPr>
+      <w:r>
+        <w:rPr>
+          <w:rFonts w:ascii="Arial" w:cs="Arial" w:eastAsia="Arial" w:hAnsi="Arial"/>
+          <w:sz w:val="23"/>
+          <w:szCs w:val="23"/>
+          <w:rtl w:val="0"/>
+        </w:rPr>
+        <w:t xml:space="preserve">BrightPath_CRM_Full_Master_Build_Prompt.docx this is my documentation link</w:t>
+      </w:r>
+    </w:p>
+    <w:p>
+      <w:pPr>
+        <w:spacing w:after="20" w:lineRule="auto"/>
+        <w:rPr/>
+      </w:pPr>
+      <w:r>
+        <w:rPr>
+          <w:rtl w:val="0"/>
+        </w:rPr>
+      </w:r>
+    </w:p>
+    <w:p>
+      <w:pPr>
+        <w:spacing w:after="20" w:lineRule="auto"/>
+        <w:rPr/>
+      </w:pPr>
+      <w:r>
+        <w:rPr>
+          <w:rtl w:val="0"/>
+        </w:rPr>
+      </w:r>
+    </w:p>
+    <w:p>
+      <w:pPr>
+        <w:spacing w:after="20" w:lineRule="auto"/>
+        <w:rPr/>
+      </w:pPr>
+      <w:r>
+        <w:rPr>
+          <w:rtl w:val="0"/>
+        </w:rPr>
+      </w:r>
+    </w:p>
+    <w:p>
+      <w:pPr>
+        <w:spacing w:after="20" w:lineRule="auto"/>
+        <w:rPr>
+          <w:rFonts w:ascii="Arial" w:cs="Arial" w:eastAsia="Arial" w:hAnsi="Arial"/>
+          <w:b w:val="1"/>
+          <w:bCs w:val="1"/>
+          <w:sz w:val="27"/>
+          <w:szCs w:val="27"/>
+        </w:rPr>
+      </w:pPr>
+      <w:r>
+        <w:rPr>
+          <w:rFonts w:ascii="Arial" w:cs="Arial" w:eastAsia="Arial" w:hAnsi="Arial"/>
+          <w:b w:val="1"/>
+          <w:bCs w:val="1"/>
+          <w:sz w:val="27"/>
+          <w:szCs w:val="27"/>
+          <w:rtl w:val="0"/>
+        </w:rPr>
+        <w:t xml:space="preserve">Prompt 2</w:t>
+      </w:r>
+    </w:p>
+    <w:p>
+      <w:pPr>
+        <w:spacing w:after="20" w:lineRule="auto"/>
+        <w:rPr/>
+      </w:pPr>
+      <w:r>
+        <w:rPr>
+          <w:rtl w:val="0"/>
+        </w:rPr>
+      </w:r>
+    </w:p>
+    <w:p>
+      <w:pPr>
+        <w:spacing w:after="20" w:lineRule="auto"/>
+        <w:rPr/>
+      </w:pPr>
+      <w:r>
+        <w:rPr>
+          <w:rtl w:val="0"/>
+        </w:rPr>
+      </w:r>
+    </w:p>
+    <w:p>
+      <w:pPr>
+        <w:spacing w:after="20" w:lineRule="auto"/>
+        <w:rPr>
+          <w:rFonts w:ascii="Arial" w:cs="Arial" w:eastAsia="Arial" w:hAnsi="Arial"/>
+          <w:sz w:val="23"/>
+          <w:szCs w:val="23"/>
+        </w:rPr>
+      </w:pPr>
+      <w:r>
+        <w:rPr>
+          <w:rFonts w:ascii="Arial" w:cs="Arial" w:eastAsia="Arial" w:hAnsi="Arial"/>
+          <w:sz w:val="23"/>
+          <w:szCs w:val="23"/>
+          <w:rtl w:val="0"/>
+        </w:rPr>
+        <w:t xml:space="preserve">create me a detailed plan following this document BrightPath_CRM_Antigravity_Full_Build_Prompt.docx where how and what features needs to be implemented in order wise list. Also I want multiple phases to be divided for this project as to cover each development feature wise where each feature will be taken at a time and will be developed, tested, verified, deployed and then agian tested and then moved to the next features. Dont edit any files yet until I approve</w:t>
+      </w:r>
+    </w:p>
+    <w:p>
+      <w:pPr>
+        <w:spacing w:after="20" w:lineRule="auto"/>
+        <w:rPr/>
+      </w:pPr>
+      <w:r>
+        <w:rPr>
+          <w:rtl w:val="0"/>
+        </w:rPr>
+      </w:r>
+    </w:p>
+    <w:p>
+      <w:pPr>
+        <w:spacing w:after="20" w:lineRule="auto"/>
+        <w:rPr/>
+      </w:pPr>
+      <w:r>
+        <w:rPr>
+          <w:rtl w:val="0"/>
+        </w:rPr>
+      </w:r>
+    </w:p>
+    <w:p>
+      <w:pPr>
+        <w:spacing w:after="20" w:lineRule="auto"/>
+        <w:rPr/>
+      </w:pPr>
+      <w:r>
+        <w:rPr>
+          <w:rtl w:val="0"/>
+        </w:rPr>
+      </w:r>
+    </w:p>
+    <w:p>
+      <w:pPr>
+        <w:spacing w:after="20" w:lineRule="auto"/>
+        <w:rPr>
+          <w:rFonts w:ascii="Arial" w:cs="Arial" w:eastAsia="Arial" w:hAnsi="Arial"/>
+          <w:b w:val="1"/>
+          <w:bCs w:val="1"/>
+          <w:sz w:val="27"/>
+          <w:szCs w:val="27"/>
+        </w:rPr>
+      </w:pPr>
+      <w:r>
+        <w:rPr>
+          <w:rFonts w:ascii="Arial" w:cs="Arial" w:eastAsia="Arial" w:hAnsi="Arial"/>
+          <w:b w:val="1"/>
+          <w:bCs w:val="1"/>
+          <w:sz w:val="27"/>
+          <w:szCs w:val="27"/>
+          <w:rtl w:val="0"/>
+        </w:rPr>
+        <w:t xml:space="preserve">Prompt 3</w:t>
+      </w:r>
+    </w:p>
+    <w:p>
+      <w:pPr>
+        <w:spacing w:after="20" w:lineRule="auto"/>
+        <w:rPr/>
+      </w:pPr>
+      <w:r>
+        <w:rPr>
+          <w:rtl w:val="0"/>
+        </w:rPr>
+      </w:r>
+    </w:p>
+    <w:p>
+      <w:pPr>
+        <w:spacing w:after="20" w:lineRule="auto"/>
+        <w:rPr/>
+      </w:pPr>
+      <w:r>
+        <w:rPr>
+          <w:rtl w:val="0"/>
+        </w:rPr>
+      </w:r>
+    </w:p>
+    <w:p>
+      <w:pPr>
+        <w:spacing w:after="20" w:lineRule="auto"/>
+        <w:rPr>
+          <w:rFonts w:ascii="Arial" w:cs="Arial" w:eastAsia="Arial" w:hAnsi="Arial"/>
+          <w:sz w:val="23"/>
+          <w:szCs w:val="23"/>
+        </w:rPr>
+      </w:pPr>
+      <w:r>
+        <w:rPr>
+          <w:rFonts w:ascii="Arial" w:cs="Arial" w:eastAsia="Arial" w:hAnsi="Arial"/>
+          <w:sz w:val="23"/>
+          <w:szCs w:val="23"/>
+          <w:rtl w:val="0"/>
+        </w:rPr>
+        <w:t xml:space="preserve">ok now create plan.md file to keep this as a context</w:t>
+      </w:r>
+    </w:p>
+    <w:p>
+      <w:pPr>
+        <w:spacing w:after="20" w:lineRule="auto"/>
+        <w:rPr/>
+      </w:pPr>
+      <w:r>
+        <w:rPr>
+          <w:rtl w:val="0"/>
+        </w:rPr>
+      </w:r>
+    </w:p>
+    <w:p>
+      <w:pPr>
+        <w:spacing w:after="20" w:lineRule="auto"/>
+        <w:rPr/>
+      </w:pPr>
+      <w:r>
+        <w:rPr>
+          <w:rtl w:val="0"/>
+        </w:rPr>
+      </w:r>
+    </w:p>
+    <w:p>
+      <w:pPr>
+        <w:spacing w:after="20" w:lineRule="auto"/>
+        <w:rPr/>
+      </w:pPr>
+      <w:r>
+        <w:rPr>
+          <w:rtl w:val="0"/>
+        </w:rPr>
+      </w:r>
+    </w:p>
+    <w:p>
+      <w:pPr>
+        <w:spacing w:after="20" w:lineRule="auto"/>
+        <w:rPr>
+          <w:rFonts w:ascii="Arial" w:cs="Arial" w:eastAsia="Arial" w:hAnsi="Arial"/>
+          <w:b w:val="1"/>
+          <w:bCs w:val="1"/>
+          <w:sz w:val="27"/>
+          <w:szCs w:val="27"/>
+        </w:rPr>
+      </w:pPr>
+      <w:r>
+        <w:rPr>
+          <w:rFonts w:ascii="Arial" w:cs="Arial" w:eastAsia="Arial" w:hAnsi="Arial"/>
+          <w:b w:val="1"/>
+          <w:bCs w:val="1"/>
+          <w:sz w:val="27"/>
+          <w:szCs w:val="27"/>
+          <w:rtl w:val="0"/>
+        </w:rPr>
+        <w:t xml:space="preserve">Prompt 4</w:t>
+      </w:r>
+    </w:p>
+    <w:p>
+      <w:pPr>
+        <w:spacing w:after="20" w:lineRule="auto"/>
+        <w:rPr/>
+      </w:pPr>
+      <w:r>
+        <w:rPr>
+          <w:rtl w:val="0"/>
+        </w:rPr>
+      </w:r>
+    </w:p>
+    <w:p>
+      <w:pPr>
+        <w:spacing w:after="20" w:lineRule="auto"/>
+        <w:rPr/>
+      </w:pPr>
+      <w:r>
+        <w:rPr>
+          <w:rtl w:val="0"/>
+        </w:rPr>
+      </w:r>
+    </w:p>
+    <w:p>
+      <w:pPr>
+        <w:spacing w:after="20" w:lineRule="auto"/>
+        <w:rPr>
+          <w:rFonts w:ascii="Arial" w:cs="Arial" w:eastAsia="Arial" w:hAnsi="Arial"/>
+          <w:sz w:val="23"/>
+          <w:szCs w:val="23"/>
+        </w:rPr>
+      </w:pPr>
+      <w:r>
+        <w:rPr>
+          <w:rFonts w:ascii="Arial" w:cs="Arial" w:eastAsia="Arial" w:hAnsi="Arial"/>
+          <w:sz w:val="23"/>
+          <w:szCs w:val="23"/>
+          <w:rtl w:val="0"/>
+        </w:rPr>
+        <w:t xml:space="preserve">Inspect plan.md and provide a detailed plan, strategy approach and flow for completing the phase 1 and don’t  change or implement anything yet until I approve</w:t>
+      </w:r>
+    </w:p>
+    <w:p>
+      <w:pPr>
+        <w:spacing w:after="20" w:lineRule="auto"/>
+        <w:rPr/>
+      </w:pPr>
+      <w:r>
+        <w:rPr>
+          <w:rtl w:val="0"/>
+        </w:rPr>
+      </w:r>
+    </w:p>
+    <w:p>
+      <w:pPr>
+        <w:spacing w:after="20" w:lineRule="auto"/>
+        <w:rPr/>
+      </w:pPr>
+      <w:r>
+        <w:rPr>
+          <w:rtl w:val="0"/>
+        </w:rPr>
+      </w:r>
+    </w:p>
+    <w:p>
+      <w:pPr>
+        <w:spacing w:after="20" w:lineRule="auto"/>
+        <w:rPr/>
+      </w:pPr>
+      <w:r>
+        <w:rPr>
+          <w:rtl w:val="0"/>
+        </w:rPr>
+      </w:r>
+    </w:p>
+    <w:p>
+      <w:pPr>
+        <w:spacing w:after="20" w:lineRule="auto"/>
+        <w:rPr/>
+      </w:pPr>
+      <w:r>
+        <w:rPr>
+          <w:rtl w:val="0"/>
+        </w:rPr>
+      </w:r>
+    </w:p>
+    <w:p>
+      <w:pPr>
+        <w:spacing w:after="20" w:lineRule="auto"/>
+        <w:rPr/>
+      </w:pPr>
+      <w:r>
+        <w:rPr>
+          <w:rtl w:val="0"/>
+        </w:rPr>
+      </w:r>
+    </w:p>
+    <w:p>
+      <w:pPr>
+        <w:spacing w:after="20" w:lineRule="auto"/>
+        <w:rPr>
+          <w:rFonts w:ascii="Arial" w:cs="Arial" w:eastAsia="Arial" w:hAnsi="Arial"/>
+          <w:sz w:val="23"/>
+          <w:szCs w:val="23"/>
+        </w:rPr>
+      </w:pPr>
+      <w:r>
+        <w:rPr>
+          <w:rFonts w:ascii="Arial" w:cs="Arial" w:eastAsia="Arial" w:hAnsi="Arial"/>
+          <w:sz w:val="23"/>
+          <w:szCs w:val="23"/>
+          <w:rtl w:val="0"/>
+        </w:rPr>
+        <w:t xml:space="preserve"> Git init</w:t>
+      </w:r>
+    </w:p>
+    <w:p>
+      <w:pPr>
+        <w:spacing w:after="20" w:lineRule="auto"/>
+        <w:rPr/>
+      </w:pPr>
+      <w:r>
+        <w:rPr>
+          <w:rtl w:val="0"/>
+        </w:rPr>
+      </w:r>
+    </w:p>
+    <w:p>
+      <w:pPr>
+        <w:spacing w:after="20" w:lineRule="auto"/>
+        <w:rPr>
+          <w:rFonts w:ascii="Arial" w:cs="Arial" w:eastAsia="Arial" w:hAnsi="Arial"/>
+          <w:sz w:val="23"/>
+          <w:szCs w:val="23"/>
+        </w:rPr>
+      </w:pPr>
+      <w:r>
+        <w:rPr>
+          <w:rFonts w:ascii="Arial" w:cs="Arial" w:eastAsia="Arial" w:hAnsi="Arial"/>
+          <w:sz w:val="23"/>
+          <w:szCs w:val="23"/>
+          <w:rtl w:val="0"/>
+        </w:rPr>
+        <w:t xml:space="preserve">Git add .</w:t>
+      </w:r>
+    </w:p>
+    <w:p>
+      <w:pPr>
+        <w:spacing w:after="20" w:lineRule="auto"/>
+        <w:rPr/>
+      </w:pPr>
+      <w:r>
+        <w:rPr>
+          <w:rtl w:val="0"/>
+        </w:rPr>
+      </w:r>
+    </w:p>
+    <w:p>
+      <w:pPr>
+        <w:spacing w:after="20" w:lineRule="auto"/>
+        <w:rPr>
+          <w:rFonts w:ascii="Arial" w:cs="Arial" w:eastAsia="Arial" w:hAnsi="Arial"/>
+          <w:sz w:val="23"/>
+          <w:szCs w:val="23"/>
+        </w:rPr>
+      </w:pPr>
+      <w:r>
+        <w:rPr>
+          <w:rFonts w:ascii="Arial" w:cs="Arial" w:eastAsia="Arial" w:hAnsi="Arial"/>
+          <w:sz w:val="23"/>
+          <w:szCs w:val="23"/>
+          <w:rtl w:val="0"/>
+        </w:rPr>
+        <w:t xml:space="preserve">Git commit -m “first commit”</w:t>
+      </w:r>
+    </w:p>
+    <w:p>
+      <w:pPr>
+        <w:spacing w:after="20" w:lineRule="auto"/>
+        <w:rPr/>
+      </w:pPr>
+      <w:r>
+        <w:rPr>
+          <w:rtl w:val="0"/>
+        </w:rPr>
+      </w:r>
+    </w:p>
+    <w:p>
+      <w:pPr>
+        <w:spacing w:after="20" w:lineRule="auto"/>
+        <w:rPr/>
+      </w:pPr>
+      <w:r>
+        <w:rPr>
+          <w:rtl w:val="0"/>
+        </w:rPr>
+      </w:r>
+    </w:p>
+    <w:p>
+      <w:pPr>
+        <w:spacing w:after="20" w:lineRule="auto"/>
+        <w:rPr>
+          <w:rFonts w:ascii="Arial" w:cs="Arial" w:eastAsia="Arial" w:hAnsi="Arial"/>
+          <w:b w:val="1"/>
+          <w:bCs w:val="1"/>
+          <w:sz w:val="27"/>
+          <w:szCs w:val="27"/>
+        </w:rPr>
+      </w:pPr>
+      <w:r>
+        <w:rPr>
+          <w:rFonts w:ascii="Arial" w:cs="Arial" w:eastAsia="Arial" w:hAnsi="Arial"/>
+          <w:b w:val="1"/>
+          <w:bCs w:val="1"/>
+          <w:sz w:val="27"/>
+          <w:szCs w:val="27"/>
+          <w:rtl w:val="0"/>
+        </w:rPr>
+        <w:t xml:space="preserve">Prompt 5</w:t>
+      </w:r>
+    </w:p>
+    <w:p>
+      <w:pPr>
+        <w:spacing w:after="20" w:lineRule="auto"/>
+        <w:rPr/>
+      </w:pPr>
+      <w:r>
+        <w:rPr>
+          <w:rtl w:val="0"/>
+        </w:rPr>
+      </w:r>
+    </w:p>
+    <w:p>
+      <w:pPr>
+        <w:spacing w:after="20" w:lineRule="auto"/>
+        <w:rPr/>
+      </w:pPr>
+      <w:r>
+        <w:rPr>
+          <w:rtl w:val="0"/>
+        </w:rPr>
+      </w:r>
+    </w:p>
+    <w:p>
+      <w:pPr>
+        <w:spacing w:after="20" w:lineRule="auto"/>
+        <w:rPr>
+          <w:rFonts w:ascii="Arial" w:cs="Arial" w:eastAsia="Arial" w:hAnsi="Arial"/>
+          <w:sz w:val="23"/>
+          <w:szCs w:val="23"/>
+        </w:rPr>
+      </w:pPr>
+      <w:r>
+        <w:rPr>
+          <w:rFonts w:ascii="Arial" w:cs="Arial" w:eastAsia="Arial" w:hAnsi="Arial"/>
+          <w:sz w:val="23"/>
+          <w:szCs w:val="23"/>
+          <w:rtl w:val="0"/>
+        </w:rPr>
+        <w:t xml:space="preserve">Inspect plan.md and provide a detailed plan, strategy approach and flow for completing the phase 2 and don’t  change or implement anything yet until I approve.I want my UI to be very much professional, non ai generated and better with animations</w:t>
+      </w:r>
+    </w:p>
+    <w:p>
+      <w:pPr>
+        <w:spacing w:after="20" w:lineRule="auto"/>
+        <w:rPr/>
+      </w:pPr>
+      <w:r>
+        <w:rPr>
+          <w:rtl w:val="0"/>
+        </w:rPr>
+      </w:r>
+    </w:p>
+    <w:p>
+      <w:pPr>
+        <w:spacing w:after="20" w:lineRule="auto"/>
+        <w:rPr/>
+      </w:pPr>
+      <w:r>
+        <w:rPr>
+          <w:rtl w:val="0"/>
+        </w:rPr>
+      </w:r>
+    </w:p>
+    <w:p>
+      <w:pPr>
+        <w:spacing w:after="20" w:lineRule="auto"/>
+        <w:rPr/>
+      </w:pPr>
+      <w:r>
+        <w:rPr>
+          <w:rtl w:val="0"/>
+        </w:rPr>
+      </w:r>
+    </w:p>
+    <w:p>
+      <w:pPr>
+        <w:spacing w:after="20" w:lineRule="auto"/>
+        <w:rPr>
+          <w:rFonts w:ascii="Arial" w:cs="Arial" w:eastAsia="Arial" w:hAnsi="Arial"/>
+          <w:b w:val="1"/>
+          <w:bCs w:val="1"/>
+          <w:sz w:val="27"/>
+          <w:szCs w:val="27"/>
+        </w:rPr>
+      </w:pPr>
+      <w:r>
+        <w:rPr>
+          <w:rFonts w:ascii="Arial" w:cs="Arial" w:eastAsia="Arial" w:hAnsi="Arial"/>
+          <w:b w:val="1"/>
+          <w:bCs w:val="1"/>
+          <w:sz w:val="27"/>
+          <w:szCs w:val="27"/>
+          <w:rtl w:val="0"/>
+        </w:rPr>
+        <w:t xml:space="preserve">Prompt 6</w:t>
+      </w:r>
+    </w:p>
+    <w:p>
+      <w:pPr>
+        <w:spacing w:after="20" w:lineRule="auto"/>
+        <w:rPr/>
+      </w:pPr>
+      <w:r>
+        <w:rPr>
+          <w:rtl w:val="0"/>
+        </w:rPr>
+      </w:r>
+    </w:p>
+    <w:p>
+      <w:pPr>
+        <w:spacing w:after="20" w:lineRule="auto"/>
+        <w:rPr/>
+      </w:pPr>
+      <w:r>
+        <w:rPr>
+          <w:rtl w:val="0"/>
+        </w:rPr>
+      </w:r>
+    </w:p>
+    <w:p>
+      <w:pPr>
+        <w:spacing w:after="20" w:lineRule="auto"/>
+        <w:rPr>
+          <w:rFonts w:ascii="Arial" w:cs="Arial" w:eastAsia="Arial" w:hAnsi="Arial"/>
+          <w:sz w:val="23"/>
+          <w:szCs w:val="23"/>
+        </w:rPr>
+      </w:pPr>
+      <w:r>
+        <w:rPr>
+          <w:rFonts w:ascii="Arial" w:cs="Arial" w:eastAsia="Arial" w:hAnsi="Arial"/>
+          <w:sz w:val="23"/>
+          <w:szCs w:val="23"/>
+          <w:rtl w:val="0"/>
+        </w:rPr>
+        <w:t xml:space="preserve">Inspect plan.md and provide a detailed plan, strategy approach and flow for completing the phase 3 and don’t  change or implement anything yet until I approve. I dont have setup my supabase project till yet.</w:t>
+      </w:r>
+    </w:p>
+    <w:p>
+      <w:pPr>
+        <w:spacing w:after="20" w:lineRule="auto"/>
+        <w:rPr/>
+      </w:pPr>
+      <w:r>
+        <w:rPr>
+          <w:rtl w:val="0"/>
+        </w:rPr>
+      </w:r>
+    </w:p>
+    <w:p>
+      <w:pPr>
+        <w:spacing w:after="20" w:lineRule="auto"/>
+        <w:rPr/>
+      </w:pPr>
+      <w:r>
+        <w:rPr>
+          <w:rtl w:val="0"/>
+        </w:rPr>
+      </w:r>
+    </w:p>
+    <w:p>
+      <w:pPr>
+        <w:spacing w:after="20" w:lineRule="auto"/>
+        <w:rPr/>
+      </w:pPr>
+      <w:r>
+        <w:rPr>
+          <w:rtl w:val="0"/>
+        </w:rPr>
+      </w:r>
+    </w:p>
+    <w:p>
+      <w:pPr>
+        <w:spacing w:after="20" w:lineRule="auto"/>
+        <w:rPr/>
+      </w:pPr>
+      <w:r>
+        <w:rPr>
+          <w:rtl w:val="0"/>
+        </w:rPr>
+      </w:r>
+    </w:p>
+    <w:p>
+      <w:pPr>
+        <w:spacing w:after="20" w:lineRule="auto"/>
+        <w:rPr>
+          <w:rFonts w:ascii="Arial" w:cs="Arial" w:eastAsia="Arial" w:hAnsi="Arial"/>
+          <w:sz w:val="23"/>
+          <w:szCs w:val="23"/>
+        </w:rPr>
+      </w:pPr>
+      <w:r>
+        <w:rPr>
+          <w:rFonts w:ascii="Arial" w:cs="Arial" w:eastAsia="Arial" w:hAnsi="Arial"/>
+          <w:sz w:val="23"/>
+          <w:szCs w:val="23"/>
+          <w:rtl w:val="0"/>
+        </w:rPr>
+        <w:t xml:space="preserve">Prompt 7</w:t>
+      </w:r>
+    </w:p>
+    <w:p>
+      <w:pPr>
+        <w:spacing w:after="20" w:lineRule="auto"/>
+        <w:rPr/>
+      </w:pPr>
+      <w:r>
+        <w:rPr>
+          <w:rtl w:val="0"/>
+        </w:rPr>
+      </w:r>
+    </w:p>
+    <w:p>
+      <w:pPr>
+        <w:spacing w:after="20" w:lineRule="auto"/>
+        <w:rPr/>
+      </w:pPr>
+      <w:r>
+        <w:rPr>
+          <w:rtl w:val="0"/>
+        </w:rPr>
+      </w:r>
+    </w:p>
+    <w:p>
+      <w:pPr>
+        <w:spacing w:after="20" w:lineRule="auto"/>
+        <w:rPr>
+          <w:rFonts w:ascii="Arial" w:cs="Arial" w:eastAsia="Arial" w:hAnsi="Arial"/>
+          <w:sz w:val="23"/>
+          <w:szCs w:val="23"/>
+        </w:rPr>
+      </w:pPr>
+      <w:r>
+        <w:rPr>
+          <w:rFonts w:ascii="Arial" w:cs="Arial" w:eastAsia="Arial" w:hAnsi="Arial"/>
+          <w:sz w:val="23"/>
+          <w:szCs w:val="23"/>
+          <w:rtl w:val="0"/>
+        </w:rPr>
+        <w:t xml:space="preserve">I have updated the supbase creds in .env please check</w:t>
+      </w:r>
+    </w:p>
+    <w:p>
+      <w:pPr>
+        <w:spacing w:after="20" w:lineRule="auto"/>
+        <w:rPr/>
+      </w:pPr>
+      <w:r>
+        <w:rPr>
+          <w:rtl w:val="0"/>
+        </w:rPr>
+      </w:r>
+    </w:p>
+    <w:p>
+      <w:pPr>
+        <w:spacing w:after="20" w:lineRule="auto"/>
+        <w:rPr/>
+      </w:pPr>
+      <w:r>
+        <w:rPr>
+          <w:rtl w:val="0"/>
+        </w:rPr>
+      </w:r>
+    </w:p>
+    <w:p>
+      <w:pPr>
+        <w:spacing w:after="20" w:lineRule="auto"/>
+        <w:rPr>
+          <w:rFonts w:ascii="Arial" w:cs="Arial" w:eastAsia="Arial" w:hAnsi="Arial"/>
+          <w:sz w:val="23"/>
+          <w:szCs w:val="23"/>
+        </w:rPr>
+      </w:pPr>
+      <w:r>
+        <w:rPr>
+          <w:rFonts w:ascii="Arial" w:cs="Arial" w:eastAsia="Arial" w:hAnsi="Arial"/>
+          <w:sz w:val="23"/>
+          <w:szCs w:val="23"/>
+          <w:rtl w:val="0"/>
+        </w:rPr>
+        <w:t xml:space="preserve">Prompt 8</w:t>
+      </w:r>
+    </w:p>
+    <w:p>
+      <w:pPr>
+        <w:spacing w:after="20" w:lineRule="auto"/>
+        <w:rPr/>
+      </w:pPr>
+      <w:r>
+        <w:rPr>
+          <w:rtl w:val="0"/>
+        </w:rPr>
+      </w:r>
+    </w:p>
+    <w:p>
+      <w:pPr>
+        <w:keepNext w:val="0"/>
+        <w:keepLines w:val="0"/>
+        <w:pageBreakBefore w:val="0"/>
+        <w:widowControl w:val="1"/>
+        <w:pBdr>
+          <w:top w:space="0" w:sz="0" w:val="nil"/>
+          <w:left w:space="0" w:sz="0" w:val="nil"/>
+          <w:bottom w:space="0" w:sz="0" w:val="nil"/>
+          <w:right w:space="0" w:sz="0" w:val="nil"/>
+          <w:between w:space="0" w:sz="0" w:val="nil"/>
+        </w:pBdr>
+        <w:shd w:fill="auto" w:val="clear"/>
+        <w:spacing w:after="20" w:before="0" w:line="276" w:lineRule="auto"/>
+        <w:ind w:right="0"/>
+        <w:jc w:val="left"/>
+        <w:rPr/>
+      </w:pPr>
+      <w:r>
+        <w:rPr>
+          <w:rFonts w:ascii="Arial" w:cs="Arial" w:eastAsia="Arial" w:hAnsi="Arial"/>
+          <w:sz w:val="23"/>
+          <w:szCs w:val="23"/>
+          <w:rtl w:val="0"/>
+        </w:rPr>
+        <w:t xml:space="preserve">Inspect plan.md and provide a detailed plan, strategy approach and flow for completing the phase 4 and don’t  change or implement anything yet until I approve.</w:t>
+      </w:r>
       <w:r>
         <w:rPr>
           <w:rtl w:val="0"/>

</xml_diff>